<commit_message>
feat(prisma): update Prisma configuration for version 7 compatibility
</commit_message>
<xml_diff>
--- a/apps/backend/prisma/prisma-guide-complet.docx
+++ b/apps/backend/prisma/prisma-guide-complet.docx
@@ -1476,14 +1476,35 @@
             <w:pPr>
               <w:spacing w:before="0" w:after="0"/>
             </w:pPr>
-            <w:r>
-              <w:rPr>
-                <w:rFonts w:ascii="Courier New" w:cs="Courier New" w:eastAsia="Courier New" w:hAnsi="Courier New"/>
-                <w:color w:val="E2E8F0"/>
-                <w:sz w:val="18"/>
-                <w:szCs w:val="18"/>
-              </w:rPr>
-              <w:t xml:space="preserve">  url      = env("DATABASE_URL")  // lu depuis .env</w:t>
+            <w:commentRangeStart w:id="1"/>
+            <w:del w:id="103" w:author="Claude" w:date="2026-04-01T00:00:00Z">
+              <w:r>
+                <w:rPr>
+                  <w:rFonts w:ascii="Courier New" w:cs="Courier New" w:eastAsia="Courier New" w:hAnsi="Courier New"/>
+                  <w:color w:val="E2E8F0"/>
+                  <w:sz w:val="18"/>
+                  <w:szCs w:val="18"/>
+                </w:rPr>
+                <w:delText xml:space="preserve">  url      = env("DATABASE_URL")  // lu depuis .env</w:delText>
+              </w:r>
+            </w:del>
+            <w:ins w:id="104" w:author="Claude" w:date="2026-04-01T00:00:00Z">
+              <w:r>
+                <w:rPr>
+                  <w:rFonts w:ascii="Courier New" w:cs="Courier New" w:eastAsia="Courier New" w:hAnsi="Courier New"/>
+                  <w:color w:val="E2E8F0"/>
+                  <w:sz w:val="18"/>
+                  <w:szCs w:val="18"/>
+                </w:rPr>
+                <w:t xml:space="preserve">  // url supprimé — Prisma 7 passe l'URL via l'adaptateur à l'initialisation</w:t>
+              </w:r>
+            </w:ins>
+            <w:commentRangeEnd w:id="1"/>
+            <w:r>
+              <w:rPr>
+                <w:rStyle w:val="CommentReference"/>
+              </w:rPr>
+              <w:commentReference w:id="1"/>
             </w:r>
           </w:p>
         </w:tc>
@@ -2018,14 +2039,35 @@
             <w:pPr>
               <w:spacing w:before="0" w:after="0"/>
             </w:pPr>
-            <w:r>
-              <w:rPr>
-                <w:rFonts w:ascii="Courier New" w:cs="Courier New" w:eastAsia="Courier New" w:hAnsi="Courier New"/>
-                <w:color w:val="E2E8F0"/>
-                <w:sz w:val="18"/>
-                <w:szCs w:val="18"/>
-              </w:rPr>
-              <w:t xml:space="preserve">  provider = "prisma-client-js"   // le générateur officiel</w:t>
+            <w:commentRangeStart w:id="0"/>
+            <w:del w:id="101" w:author="Claude" w:date="2026-04-01T00:00:00Z">
+              <w:r>
+                <w:rPr>
+                  <w:rFonts w:ascii="Courier New" w:cs="Courier New" w:eastAsia="Courier New" w:hAnsi="Courier New"/>
+                  <w:color w:val="E2E8F0"/>
+                  <w:sz w:val="18"/>
+                  <w:szCs w:val="18"/>
+                </w:rPr>
+                <w:delText xml:space="preserve">  provider = "prisma-client-js"   // le générateur officiel</w:delText>
+              </w:r>
+            </w:del>
+            <w:ins w:id="102" w:author="Claude" w:date="2026-04-01T00:00:00Z">
+              <w:r>
+                <w:rPr>
+                  <w:rFonts w:ascii="Courier New" w:cs="Courier New" w:eastAsia="Courier New" w:hAnsi="Courier New"/>
+                  <w:color w:val="E2E8F0"/>
+                  <w:sz w:val="18"/>
+                  <w:szCs w:val="18"/>
+                </w:rPr>
+                <w:t xml:space="preserve">  provider = "prisma-client"      // Prisma 7 — remplace "prisma-client-js"</w:t>
+              </w:r>
+            </w:ins>
+            <w:commentRangeEnd w:id="0"/>
+            <w:r>
+              <w:rPr>
+                <w:rStyle w:val="CommentReference"/>
+              </w:rPr>
+              <w:commentReference w:id="0"/>
             </w:r>
           </w:p>
         </w:tc>
@@ -11425,14 +11467,35 @@
             <w:pPr>
               <w:spacing w:before="0" w:after="0"/>
             </w:pPr>
-            <w:r>
-              <w:rPr>
-                <w:rFonts w:ascii="Courier New" w:cs="Courier New" w:eastAsia="Courier New" w:hAnsi="Courier New"/>
-                <w:color w:val="E2E8F0"/>
-                <w:sz w:val="18"/>
-                <w:szCs w:val="18"/>
-              </w:rPr>
-              <w:t xml:space="preserve">import { PrismaClient } from '@prisma/client';</w:t>
+            <w:commentRangeStart w:id="2"/>
+            <w:del w:id="105" w:author="Claude" w:date="2026-04-01T00:00:00Z">
+              <w:r>
+                <w:rPr>
+                  <w:rFonts w:ascii="Courier New" w:cs="Courier New" w:eastAsia="Courier New" w:hAnsi="Courier New"/>
+                  <w:color w:val="E2E8F0"/>
+                  <w:sz w:val="18"/>
+                  <w:szCs w:val="18"/>
+                </w:rPr>
+                <w:delText xml:space="preserve">import { PrismaClient } from '@prisma/client';</w:delText>
+              </w:r>
+            </w:del>
+            <w:ins w:id="106" w:author="Claude" w:date="2026-04-01T00:00:00Z">
+              <w:r>
+                <w:rPr>
+                  <w:rFonts w:ascii="Courier New" w:cs="Courier New" w:eastAsia="Courier New" w:hAnsi="Courier New"/>
+                  <w:color w:val="E2E8F0"/>
+                  <w:sz w:val="18"/>
+                  <w:szCs w:val="18"/>
+                </w:rPr>
+                <w:t xml:space="preserve">import { PrismaClient } from '../generated/prisma'; // Prisma 7 — chemin vers le client généré</w:t>
+              </w:r>
+            </w:ins>
+            <w:commentRangeEnd w:id="2"/>
+            <w:r>
+              <w:rPr>
+                <w:rStyle w:val="CommentReference"/>
+              </w:rPr>
+              <w:commentReference w:id="2"/>
             </w:r>
           </w:p>
         </w:tc>
@@ -11493,14 +11556,35 @@
             <w:pPr>
               <w:spacing w:before="0" w:after="0"/>
             </w:pPr>
-            <w:r>
-              <w:rPr>
-                <w:rFonts w:ascii="Courier New" w:cs="Courier New" w:eastAsia="Courier New" w:hAnsi="Courier New"/>
-                <w:color w:val="E2E8F0"/>
-                <w:sz w:val="18"/>
-                <w:szCs w:val="18"/>
-              </w:rPr>
-              <w:t xml:space="preserve">// Pattern singleton recommandé (évite les connexions multiples en dev)</w:t>
+            <w:commentRangeStart w:id="3"/>
+            <w:del w:id="107" w:author="Claude" w:date="2026-04-01T00:00:00Z">
+              <w:r>
+                <w:rPr>
+                  <w:rFonts w:ascii="Courier New" w:cs="Courier New" w:eastAsia="Courier New" w:hAnsi="Courier New"/>
+                  <w:color w:val="E2E8F0"/>
+                  <w:sz w:val="18"/>
+                  <w:szCs w:val="18"/>
+                </w:rPr>
+                <w:delText xml:space="preserve">// Pattern singleton recommandé (évite les connexions multiples en dev)</w:delText>
+              </w:r>
+            </w:del>
+            <w:ins w:id="108" w:author="Claude" w:date="2026-04-01T00:00:00Z">
+              <w:r>
+                <w:rPr>
+                  <w:rFonts w:ascii="Courier New" w:cs="Courier New" w:eastAsia="Courier New" w:hAnsi="Courier New"/>
+                  <w:color w:val="E2E8F0"/>
+                  <w:sz w:val="18"/>
+                  <w:szCs w:val="18"/>
+                </w:rPr>
+                <w:t xml:space="preserve">import { PrismaPg } from '@prisma/adapter-pg'; // pnpm add @prisma/adapter-pg</w:t>
+              </w:r>
+            </w:ins>
+            <w:commentRangeEnd w:id="3"/>
+            <w:r>
+              <w:rPr>
+                <w:rStyle w:val="CommentReference"/>
+              </w:rPr>
+              <w:commentReference w:id="3"/>
             </w:r>
           </w:p>
         </w:tc>
@@ -11629,15 +11713,28 @@
             <w:pPr>
               <w:spacing w:before="0" w:after="0"/>
             </w:pPr>
-            <w:r>
-              <w:rPr>
-                <w:rFonts w:ascii="Courier New" w:cs="Courier New" w:eastAsia="Courier New" w:hAnsi="Courier New"/>
-                <w:color w:val="E2E8F0"/>
-                <w:sz w:val="18"/>
-                <w:szCs w:val="18"/>
-              </w:rPr>
-              <w:t xml:space="preserve">  globalForPrisma.prisma ?? new PrismaClient({ log: ['query', 'error'] });</w:t>
-            </w:r>
+            <w:del w:id="109" w:author="Claude" w:date="2026-04-01T00:00:00Z">
+              <w:r>
+                <w:rPr>
+                  <w:rFonts w:ascii="Courier New" w:cs="Courier New" w:eastAsia="Courier New" w:hAnsi="Courier New"/>
+                  <w:color w:val="E2E8F0"/>
+                  <w:sz w:val="18"/>
+                  <w:szCs w:val="18"/>
+                </w:rPr>
+                <w:delText xml:space="preserve">  globalForPrisma.prisma ?? new PrismaClient({ log: ['query', 'error'] });</w:delText>
+              </w:r>
+            </w:del>
+            <w:ins w:id="110" w:author="Claude" w:date="2026-04-01T00:00:00Z">
+              <w:r>
+                <w:rPr>
+                  <w:rFonts w:ascii="Courier New" w:cs="Courier New" w:eastAsia="Courier New" w:hAnsi="Courier New"/>
+                  <w:color w:val="E2E8F0"/>
+                  <w:sz w:val="18"/>
+                  <w:szCs w:val="18"/>
+                </w:rPr>
+                <w:t xml:space="preserve">  globalForPrisma.prisma ?? new PrismaClient({ adapter: new PrismaPg({ connectionString: process.env.DATABASE_URL }), log: ['query', 'error'] });</w:t>
+              </w:r>
+            </w:ins>
           </w:p>
         </w:tc>
       </w:tr>
@@ -29235,7 +29332,36 @@
 </file>
 
 <file path=word/comments.xml><?xml version="1.0" encoding="utf-8"?>
-<w:comments xmlns:cx="http://schemas.microsoft.com/office/drawing/2014/chartex" xmlns:cx1="http://schemas.microsoft.com/office/drawing/2015/9/8/chartex" xmlns:cx2="http://schemas.microsoft.com/office/drawing/2015/10/21/chartex" xmlns:cx3="http://schemas.microsoft.com/office/drawing/2016/5/9/chartex" xmlns:cx4="http://schemas.microsoft.com/office/drawing/2016/5/10/chartex" xmlns:cx5="http://schemas.microsoft.com/office/drawing/2016/5/11/chartex" xmlns:cx6="http://schemas.microsoft.com/office/drawing/2016/5/12/chartex" xmlns:cx7="http://schemas.microsoft.com/office/drawing/2016/5/13/chartex" xmlns:cx8="http://schemas.microsoft.com/office/drawing/2016/5/14/chartex" xmlns:mc="http://schemas.openxmlformats.org/markup-compatibility/2006" xmlns:aink="http://schemas.microsoft.com/office/drawing/2016/ink" xmlns:am3d="http://schemas.microsoft.com/office/drawing/2017/model3d" xmlns:o="urn:schemas-microsoft-com:office:office" xmlns:r="http://schemas.openxmlformats.org/officeDocument/2006/relationships" xmlns:m="http://schemas.openxmlformats.org/officeDocument/2006/math" xmlns:v="urn:schemas-microsoft-com:vml" xmlns:wp14="http://schemas.microsoft.com/office/word/2010/wordprocessingDrawing" xmlns:wp="http://schemas.openxmlformats.org/drawingml/2006/wordprocessingDrawing" xmlns:w10="urn:schemas-microsoft-com:office:word" xmlns:w="http://schemas.openxmlformats.org/wordprocessingml/2006/main" xmlns:w14="http://schemas.microsoft.com/office/word/2010/wordml" xmlns:w15="http://schemas.microsoft.com/office/word/2012/wordml" xmlns:w16cex="http://schemas.microsoft.com/office/word/2018/wordml/cex" xmlns:w16cid="http://schemas.microsoft.com/office/word/2016/wordml/cid" xmlns:w16="http://schemas.microsoft.com/office/word/2018/wordml" xmlns:w16sdtdh="http://schemas.microsoft.com/office/word/2020/wordml/sdtdatahash" xmlns:w16se="http://schemas.microsoft.com/office/word/2015/wordml/symex" xmlns:wpg="http://schemas.microsoft.com/office/word/2010/wordprocessingGroup" xmlns:wpi="http://schemas.microsoft.com/office/word/2010/wordprocessingInk" xmlns:wne="http://schemas.microsoft.com/office/word/2006/wordml" xmlns:wps="http://schemas.microsoft.com/office/word/2010/wordprocessingShape"/>
+<w:comments xmlns:cx="http://schemas.microsoft.com/office/drawing/2014/chartex" xmlns:cx1="http://schemas.microsoft.com/office/drawing/2015/9/8/chartex" xmlns:cx2="http://schemas.microsoft.com/office/drawing/2015/10/21/chartex" xmlns:cx3="http://schemas.microsoft.com/office/drawing/2016/5/9/chartex" xmlns:cx4="http://schemas.microsoft.com/office/drawing/2016/5/10/chartex" xmlns:cx5="http://schemas.microsoft.com/office/drawing/2016/5/11/chartex" xmlns:cx6="http://schemas.microsoft.com/office/drawing/2016/5/12/chartex" xmlns:cx7="http://schemas.microsoft.com/office/drawing/2016/5/13/chartex" xmlns:cx8="http://schemas.microsoft.com/office/drawing/2016/5/14/chartex" xmlns:mc="http://schemas.openxmlformats.org/markup-compatibility/2006" xmlns:aink="http://schemas.microsoft.com/office/drawing/2016/ink" xmlns:am3d="http://schemas.microsoft.com/office/drawing/2017/model3d" xmlns:o="urn:schemas-microsoft-com:office:office" xmlns:r="http://schemas.openxmlformats.org/officeDocument/2006/relationships" xmlns:m="http://schemas.openxmlformats.org/officeDocument/2006/math" xmlns:v="urn:schemas-microsoft-com:vml" xmlns:wp14="http://schemas.microsoft.com/office/word/2010/wordprocessingDrawing" xmlns:wp="http://schemas.openxmlformats.org/drawingml/2006/wordprocessingDrawing" xmlns:w10="urn:schemas-microsoft-com:office:word" xmlns:w="http://schemas.openxmlformats.org/wordprocessingml/2006/main" xmlns:w14="http://schemas.microsoft.com/office/word/2010/wordml" xmlns:w15="http://schemas.microsoft.com/office/word/2012/wordml" xmlns:w16cex="http://schemas.microsoft.com/office/word/2018/wordml/cex" xmlns:w16cid="http://schemas.microsoft.com/office/word/2016/wordml/cid" xmlns:w16="http://schemas.microsoft.com/office/word/2018/wordml" xmlns:w16sdtdh="http://schemas.microsoft.com/office/word/2020/wordml/sdtdatahash" xmlns:w16se="http://schemas.microsoft.com/office/word/2015/wordml/symex" xmlns:wpg="http://schemas.microsoft.com/office/word/2010/wordprocessingGroup" xmlns:wpi="http://schemas.microsoft.com/office/word/2010/wordprocessingInk" xmlns:wne="http://schemas.microsoft.com/office/word/2006/wordml" xmlns:wps="http://schemas.microsoft.com/office/word/2010/wordprocessingShape">
+  <w:comment w:id="0" w:author="Claude" w:date="2026-04-01T00:00:00Z" w:initials="CL">
+    <w:p>
+      <w:r>
+        <w:t>Prisma 7 : le provider "prisma-client-js" est renommé en "prisma-client". Mettre à jour toutes les références dans le schema.</w:t>
+      </w:r>
+    </w:p>
+  </w:comment>
+  <w:comment w:id="1" w:author="Claude" w:date="2026-04-01T00:00:00Z" w:initials="CL">
+    <w:p>
+      <w:r>
+        <w:t>Prisma 7 : l’URL n’est plus déclarée dans le schema. Elle est passée à l’exécution via l’adaptateur (ex: PrismaPg). Voir section 4.1.</w:t>
+      </w:r>
+    </w:p>
+  </w:comment>
+  <w:comment w:id="2" w:author="Claude" w:date="2026-04-01T00:00:00Z" w:initials="CL">
+    <w:p>
+      <w:r>
+        <w:t>Prisma 7 : le client est généré dans le dossier output du schema (../generated/prisma), plus dans node_modules/@prisma/client. Adapter tous les imports en conséquence.</w:t>
+      </w:r>
+    </w:p>
+  </w:comment>
+  <w:comment w:id="3" w:author="Claude" w:date="2026-04-01T00:00:00Z" w:initials="CL">
+    <w:p>
+      <w:r>
+        <w:t>Prisma 7 : PrismaClient exige maintenant un adaptateur explicite. Installer @prisma/adapter-pg (pnpm add @prisma/adapter-pg) et passer un PrismaPg avec connectionString. Sans cela, une PrismaClientInitializationError est levée au démarrage.</w:t>
+      </w:r>
+    </w:p>
+  </w:comment>
+</w:comments>
 </file>
 
 <file path=word/footer1.xml><?xml version="1.0" encoding="utf-8"?>

</xml_diff>